<commit_message>
Pulir luz de la espada con postura animada y efectos de energia
</commit_message>
<xml_diff>
--- a/docs/Tlamani_Documentacion.docx
+++ b/docs/Tlamani_Documentacion.docx
@@ -207,7 +207,12 @@
     </w:p>
     <w:p>
       <w:r>
-        <w:t>El rayo tiene un alcance de 5,5 unidades y se detiene en el primer obstáculo u objetivo. Consume 18 puntos de energía por segundo de una reserva de 100. La luz debilita durante 3 segundos: abre las defensas, reduce la movilidad y prolonga la preparación y recuperación de los ataques enemigos.</w:t>
+        <w:t>Tlamani prepara la espada durante 0,24 segundos y la apunta en horizontal. El rayo sale de la punta con núcleo luminoso, halo, chispas y destello de contacto. Las piernas conservan la caminata y adoptan una postura aérea al saltar. Al soltar el control, baja el arma. El puma emite luz desde el frente de la cabeza.</w:t>
+      </w:r>
+    </w:p>
+    <w:p>
+      <w:r>
+        <w:t>El rayo alcanza 5,5 unidades y se detiene en obstáculos u objetivos. Consume 18 puntos de energía por segundo de una reserva de 100; la preparación no consume energía. La luz debilita durante 3 segundos: abre defensas, reduce movilidad y prolonga la preparación y recuperación de los ataques enemigos.</w:t>
       </w:r>
     </w:p>
     <w:p>
@@ -316,7 +321,7 @@
     </w:p>
     <w:p>
       <w:r>
-        <w:t>Se ejecutaron 38 pruebas PlayMode en Unity y todas fueron aprobadas. Cubren el movimiento previo, las colisiones, el ataque terrestre y aéreo, el alcance y las paredes, el daño y la muerte, la transformación bajo techos, el consumo y la recarga de energía, los mecanismos, los patrones enemigos, las fases de Llanthu, la victoria, la pausa y el reintento.</w:t>
+        <w:t>Se ejecutaron 42 pruebas PlayMode en Unity y todas fueron aprobadas. Cubren el movimiento previo, las colisiones, el ataque terrestre y aéreo, el alcance y las paredes, el daño y la muerte, la transformación bajo techos, el consumo y la recarga de energía, los mecanismos, los patrones enemigos, las fases de Llanthu, la victoria, la pausa y el reintento.</w:t>
       </w:r>
     </w:p>
     <w:p>
@@ -336,7 +341,7 @@
         <w:spacing w:before="0"/>
       </w:pPr>
       <w:r>
-        <w:t>Capturas de Unity: movimiento y ataque</w:t>
+        <w:t>Capturas de Unity: movimiento y luz</w:t>
       </w:r>
     </w:p>
     <w:p>
@@ -400,7 +405,7 @@
         <w:drawing>
           <wp:inline xmlns:a="http://schemas.openxmlformats.org/drawingml/2006/main" xmlns:pic="http://schemas.openxmlformats.org/drawingml/2006/picture">
             <wp:extent cx="5760720" cy="3240405"/>
-            <wp:docPr id="2" name="Picture 2" descr="Figura 2. Ataque cuerpo a cuerpo contra Apasanka en la Galería de la Luz." title="08-ataque"/>
+            <wp:docPr id="2" name="Picture 2" descr="Figura 2. Espada horizontal: el rayo sale de la punta y debilita al Guerrero Corrupto." title="14-luz-espada"/>
             <wp:cNvGraphicFramePr>
               <a:graphicFrameLocks noChangeAspect="1"/>
             </wp:cNvGraphicFramePr>
@@ -408,7 +413,7 @@
               <a:graphicData uri="http://schemas.openxmlformats.org/drawingml/2006/picture">
                 <pic:pic>
                   <pic:nvPicPr>
-                    <pic:cNvPr id="0" name="08-ataque.png"/>
+                    <pic:cNvPr id="0" name="14-luz-espada.png"/>
                     <pic:cNvPicPr/>
                   </pic:nvPicPr>
                   <pic:blipFill>
@@ -437,7 +442,7 @@
         <w:keepLines/>
       </w:pPr>
       <w:r>
-        <w:t>Figura 2. Ataque cuerpo a cuerpo contra Apasanka en la Galería de la Luz.</w:t>
+        <w:t>Figura 2. Espada horizontal: el rayo sale de la punta y debilita al Guerrero Corrupto.</w:t>
       </w:r>
     </w:p>
     <w:p>

</xml_diff>